<commit_message>
Actualiza plantilla del contrato a la Versión 0001 (18/09/2026)
Co-Authored-By: Claude Sonnet 5 <noreply@anthropic.com>
</commit_message>
<xml_diff>
--- a/app/documents/contrato_turismo/template.docx
+++ b/app/documents/contrato_turismo/template.docx
@@ -51,11 +51,22 @@
         <w:jc w:val="center"/>
         <w:rPr>
           <w:rFonts w:asciiTheme="minorHAnsi" w:hAnsiTheme="minorHAnsi" w:cstheme="minorHAnsi"/>
-          <w:b/>
-          <w:sz w:val="22"/>
-          <w:szCs w:val="22"/>
-        </w:rPr>
-      </w:pPr>
+          <w:bCs/>
+          <w:sz w:val="22"/>
+          <w:szCs w:val="22"/>
+          <w:u w:val="single"/>
+        </w:rPr>
+      </w:pPr>
+      <w:r>
+        <w:rPr>
+          <w:rFonts w:asciiTheme="minorHAnsi" w:hAnsiTheme="minorHAnsi" w:cstheme="minorHAnsi"/>
+          <w:bCs/>
+          <w:sz w:val="22"/>
+          <w:szCs w:val="22"/>
+          <w:u w:val="single"/>
+        </w:rPr>
+        <w:t>Versión 0001 18/09/2026</w:t>
+      </w:r>
     </w:p>
     <w:p>
       <w:pPr>
@@ -304,7 +315,23 @@
                 <w:sz w:val="22"/>
                 <w:szCs w:val="22"/>
               </w:rPr>
-              <w:t>YERICA AGUIRRE LONDOÑO</w:t>
+              <w:t>YERICA LONDOÑO</w:t>
+            </w:r>
+            <w:r>
+              <w:rPr>
+                <w:rFonts w:asciiTheme="minorHAnsi" w:hAnsiTheme="minorHAnsi" w:cstheme="minorHAnsi"/>
+                <w:sz w:val="22"/>
+                <w:szCs w:val="22"/>
+              </w:rPr>
+              <w:t xml:space="preserve"> </w:t>
+            </w:r>
+            <w:r>
+              <w:rPr>
+                <w:rFonts w:asciiTheme="minorHAnsi" w:hAnsiTheme="minorHAnsi" w:cstheme="minorHAnsi"/>
+                <w:sz w:val="22"/>
+                <w:szCs w:val="22"/>
+              </w:rPr>
+              <w:t>AGUIRRE</w:t>
             </w:r>
           </w:p>
         </w:tc>
@@ -552,7 +579,15 @@
                 <w:sz w:val="22"/>
                 <w:szCs w:val="22"/>
               </w:rPr>
-              <w:t>139391</w:t>
+              <w:t>1</w:t>
+            </w:r>
+            <w:r>
+              <w:rPr>
+                <w:rFonts w:asciiTheme="minorHAnsi" w:hAnsiTheme="minorHAnsi" w:cstheme="minorHAnsi"/>
+                <w:sz w:val="22"/>
+                <w:szCs w:val="22"/>
+              </w:rPr>
+              <w:t>48210</w:t>
             </w:r>
           </w:p>
         </w:tc>
@@ -1039,16 +1074,14 @@
         </w:rPr>
         <w:t xml:space="preserve">Las partes contratantes, mayores de edad e identificados como aparece al píe de su correspondiente firma, han acordado celebrar el presente Contrato de Turismo, el cual estará regido por el ordenamiento jurídico </w:t>
       </w:r>
-      <w:proofErr w:type="gramStart"/>
-      <w:r>
-        <w:rPr>
-          <w:rFonts w:asciiTheme="minorHAnsi" w:hAnsiTheme="minorHAnsi" w:cstheme="minorHAnsi"/>
-          <w:sz w:val="22"/>
-          <w:szCs w:val="22"/>
-        </w:rPr>
-        <w:t>Colombiano</w:t>
-      </w:r>
-      <w:proofErr w:type="gramEnd"/>
+      <w:r>
+        <w:rPr>
+          <w:rFonts w:asciiTheme="minorHAnsi" w:hAnsiTheme="minorHAnsi" w:cstheme="minorHAnsi"/>
+          <w:sz w:val="22"/>
+          <w:szCs w:val="22"/>
+        </w:rPr>
+        <w:t>colombiano</w:t>
+      </w:r>
       <w:r>
         <w:rPr>
           <w:rFonts w:asciiTheme="minorHAnsi" w:hAnsiTheme="minorHAnsi" w:cstheme="minorHAnsi"/>
@@ -1805,16 +1838,14 @@
         </w:rPr>
         <w:t xml:space="preserve"> El valor del PLAN TURÍSTICO que ha decidido tomar EL CLIENTE constará en la confirmación de reserva aceptada por el CLIENTE, en donde se especificará </w:t>
       </w:r>
-      <w:proofErr w:type="spellStart"/>
-      <w:r>
-        <w:rPr>
-          <w:rFonts w:asciiTheme="minorHAnsi" w:hAnsiTheme="minorHAnsi" w:cstheme="minorHAnsi"/>
-          <w:sz w:val="22"/>
-          <w:szCs w:val="22"/>
-        </w:rPr>
-        <w:t>cuales</w:t>
-      </w:r>
-      <w:proofErr w:type="spellEnd"/>
+      <w:r>
+        <w:rPr>
+          <w:rFonts w:asciiTheme="minorHAnsi" w:hAnsiTheme="minorHAnsi" w:cstheme="minorHAnsi"/>
+          <w:sz w:val="22"/>
+          <w:szCs w:val="22"/>
+        </w:rPr>
+        <w:t>cuáles</w:t>
+      </w:r>
       <w:r>
         <w:rPr>
           <w:rFonts w:asciiTheme="minorHAnsi" w:hAnsiTheme="minorHAnsi" w:cstheme="minorHAnsi"/>
@@ -2472,6 +2503,8 @@
         <w:spacing w:after="0" w:line="240" w:lineRule="auto"/>
         <w:rPr>
           <w:rFonts w:asciiTheme="minorHAnsi" w:eastAsia="Times New Roman" w:hAnsiTheme="minorHAnsi" w:cstheme="minorHAnsi"/>
+          <w:b/>
+          <w:bCs/>
           <w:color w:val="000000"/>
           <w:sz w:val="22"/>
           <w:szCs w:val="22"/>
@@ -2482,16 +2515,20 @@
       <w:r>
         <w:rPr>
           <w:rFonts w:asciiTheme="minorHAnsi" w:eastAsia="Times New Roman" w:hAnsiTheme="minorHAnsi" w:cstheme="minorHAnsi"/>
+          <w:b/>
+          <w:bCs/>
           <w:color w:val="000000"/>
           <w:sz w:val="22"/>
           <w:szCs w:val="22"/>
           <w:shd w:val="clear" w:color="auto" w:fill="FFFFFF"/>
           <w:lang w:eastAsia="es-MX"/>
         </w:rPr>
-        <w:t xml:space="preserve">BACOLOMBIA: Cta Ahorros 609-000017-11, </w:t>
-      </w:r>
-      <w:proofErr w:type="spellStart"/>
-      <w:r>
+        <w:t xml:space="preserve">BANCOLOMBIA: </w:t>
+      </w:r>
+    </w:p>
+    <w:p>
+      <w:pPr>
+        <w:spacing w:after="0" w:line="240" w:lineRule="auto"/>
         <w:rPr>
           <w:rFonts w:asciiTheme="minorHAnsi" w:eastAsia="Times New Roman" w:hAnsiTheme="minorHAnsi" w:cstheme="minorHAnsi"/>
           <w:color w:val="000000"/>
@@ -2500,9 +2537,7 @@
           <w:shd w:val="clear" w:color="auto" w:fill="FFFFFF"/>
           <w:lang w:eastAsia="es-MX"/>
         </w:rPr>
-        <w:t>cta</w:t>
-      </w:r>
-      <w:proofErr w:type="spellEnd"/>
+      </w:pPr>
       <w:r>
         <w:rPr>
           <w:rFonts w:asciiTheme="minorHAnsi" w:eastAsia="Times New Roman" w:hAnsiTheme="minorHAnsi" w:cstheme="minorHAnsi"/>
@@ -2512,7 +2547,7 @@
           <w:shd w:val="clear" w:color="auto" w:fill="FFFFFF"/>
           <w:lang w:eastAsia="es-MX"/>
         </w:rPr>
-        <w:t xml:space="preserve"> Ahorros 609-887952-43</w:t>
+        <w:t xml:space="preserve">Cta Ahorros 609-000017-11, </w:t>
       </w:r>
       <w:r>
         <w:rPr>
@@ -2523,9 +2558,8 @@
           <w:shd w:val="clear" w:color="auto" w:fill="FFFFFF"/>
           <w:lang w:eastAsia="es-MX"/>
         </w:rPr>
-        <w:t xml:space="preserve">. </w:t>
-      </w:r>
-      <w:proofErr w:type="spellStart"/>
+        <w:t>C</w:t>
+      </w:r>
       <w:r>
         <w:rPr>
           <w:rFonts w:asciiTheme="minorHAnsi" w:eastAsia="Times New Roman" w:hAnsiTheme="minorHAnsi" w:cstheme="minorHAnsi"/>
@@ -2535,9 +2569,12 @@
           <w:shd w:val="clear" w:color="auto" w:fill="FFFFFF"/>
           <w:lang w:eastAsia="es-MX"/>
         </w:rPr>
-        <w:t>C</w:t>
-      </w:r>
-      <w:r>
+        <w:t>ta Ahorros 609-887952-43.</w:t>
+      </w:r>
+    </w:p>
+    <w:p>
+      <w:pPr>
+        <w:spacing w:after="0" w:line="240" w:lineRule="auto"/>
         <w:rPr>
           <w:rFonts w:asciiTheme="minorHAnsi" w:eastAsia="Times New Roman" w:hAnsiTheme="minorHAnsi" w:cstheme="minorHAnsi"/>
           <w:color w:val="000000"/>
@@ -2546,9 +2583,7 @@
           <w:shd w:val="clear" w:color="auto" w:fill="FFFFFF"/>
           <w:lang w:eastAsia="es-MX"/>
         </w:rPr>
-        <w:t>cta</w:t>
-      </w:r>
-      <w:proofErr w:type="spellEnd"/>
+      </w:pPr>
       <w:r>
         <w:rPr>
           <w:rFonts w:asciiTheme="minorHAnsi" w:eastAsia="Times New Roman" w:hAnsiTheme="minorHAnsi" w:cstheme="minorHAnsi"/>
@@ -2558,7 +2593,7 @@
           <w:shd w:val="clear" w:color="auto" w:fill="FFFFFF"/>
           <w:lang w:eastAsia="es-MX"/>
         </w:rPr>
-        <w:t xml:space="preserve"> Ahorros 609-000188-20 (CORPORATIVOS)</w:t>
+        <w:t xml:space="preserve">Cta Ahorros 609-000188-20 (CORPORATIVOS) </w:t>
       </w:r>
     </w:p>
     <w:p>
@@ -2582,7 +2617,7 @@
           <w:shd w:val="clear" w:color="auto" w:fill="FFFFFF"/>
           <w:lang w:eastAsia="es-MX"/>
         </w:rPr>
-        <w:t>DAVIVIENDA: Cta ahorros 108900167553</w:t>
+        <w:t>Cta Corriente 609-000066-16 (Oficina Bogotá)</w:t>
       </w:r>
     </w:p>
     <w:p>
@@ -2597,7 +2632,10 @@
           <w:lang w:eastAsia="es-MX"/>
         </w:rPr>
       </w:pPr>
-      <w:r>
+    </w:p>
+    <w:p>
+      <w:pPr>
+        <w:spacing w:after="0" w:line="240" w:lineRule="auto"/>
         <w:rPr>
           <w:rFonts w:asciiTheme="minorHAnsi" w:eastAsia="Times New Roman" w:hAnsiTheme="minorHAnsi" w:cstheme="minorHAnsi"/>
           <w:color w:val="000000"/>
@@ -2606,18 +2644,128 @@
           <w:shd w:val="clear" w:color="auto" w:fill="FFFFFF"/>
           <w:lang w:eastAsia="es-MX"/>
         </w:rPr>
-        <w:t xml:space="preserve">BBVA: Cta </w:t>
-      </w:r>
+      </w:pPr>
       <w:r>
         <w:rPr>
           <w:rFonts w:asciiTheme="minorHAnsi" w:eastAsia="Times New Roman" w:hAnsiTheme="minorHAnsi" w:cstheme="minorHAnsi"/>
+          <w:b/>
+          <w:bCs/>
           <w:color w:val="000000"/>
           <w:sz w:val="22"/>
           <w:szCs w:val="22"/>
           <w:shd w:val="clear" w:color="auto" w:fill="FFFFFF"/>
           <w:lang w:eastAsia="es-MX"/>
         </w:rPr>
-        <w:t>Corriente 0569026511</w:t>
+        <w:t>DAVIVIENDA</w:t>
+      </w:r>
+      <w:r>
+        <w:rPr>
+          <w:rFonts w:asciiTheme="minorHAnsi" w:eastAsia="Times New Roman" w:hAnsiTheme="minorHAnsi" w:cstheme="minorHAnsi"/>
+          <w:color w:val="000000"/>
+          <w:sz w:val="22"/>
+          <w:szCs w:val="22"/>
+          <w:shd w:val="clear" w:color="auto" w:fill="FFFFFF"/>
+          <w:lang w:eastAsia="es-MX"/>
+        </w:rPr>
+        <w:t xml:space="preserve">: </w:t>
+      </w:r>
+    </w:p>
+    <w:p>
+      <w:pPr>
+        <w:spacing w:after="0" w:line="240" w:lineRule="auto"/>
+        <w:rPr>
+          <w:rFonts w:asciiTheme="minorHAnsi" w:eastAsia="Times New Roman" w:hAnsiTheme="minorHAnsi" w:cstheme="minorHAnsi"/>
+          <w:color w:val="000000"/>
+          <w:sz w:val="22"/>
+          <w:szCs w:val="22"/>
+          <w:shd w:val="clear" w:color="auto" w:fill="FFFFFF"/>
+          <w:lang w:eastAsia="es-MX"/>
+        </w:rPr>
+      </w:pPr>
+      <w:r>
+        <w:rPr>
+          <w:rFonts w:asciiTheme="minorHAnsi" w:eastAsia="Times New Roman" w:hAnsiTheme="minorHAnsi" w:cstheme="minorHAnsi"/>
+          <w:color w:val="000000"/>
+          <w:sz w:val="22"/>
+          <w:szCs w:val="22"/>
+          <w:shd w:val="clear" w:color="auto" w:fill="FFFFFF"/>
+          <w:lang w:eastAsia="es-MX"/>
+        </w:rPr>
+        <w:t>Cta ahorros 108900167553</w:t>
+      </w:r>
+    </w:p>
+    <w:p>
+      <w:pPr>
+        <w:spacing w:after="0" w:line="240" w:lineRule="auto"/>
+        <w:rPr>
+          <w:rFonts w:asciiTheme="minorHAnsi" w:eastAsia="Times New Roman" w:hAnsiTheme="minorHAnsi" w:cstheme="minorHAnsi"/>
+          <w:color w:val="000000"/>
+          <w:sz w:val="22"/>
+          <w:szCs w:val="22"/>
+          <w:shd w:val="clear" w:color="auto" w:fill="FFFFFF"/>
+          <w:lang w:eastAsia="es-MX"/>
+        </w:rPr>
+      </w:pPr>
+    </w:p>
+    <w:p>
+      <w:pPr>
+        <w:spacing w:after="0" w:line="240" w:lineRule="auto"/>
+        <w:rPr>
+          <w:rFonts w:asciiTheme="minorHAnsi" w:eastAsia="Times New Roman" w:hAnsiTheme="minorHAnsi" w:cstheme="minorHAnsi"/>
+          <w:color w:val="000000"/>
+          <w:sz w:val="22"/>
+          <w:szCs w:val="22"/>
+          <w:shd w:val="clear" w:color="auto" w:fill="FFFFFF"/>
+          <w:lang w:eastAsia="es-MX"/>
+        </w:rPr>
+      </w:pPr>
+      <w:r>
+        <w:rPr>
+          <w:rFonts w:asciiTheme="minorHAnsi" w:eastAsia="Times New Roman" w:hAnsiTheme="minorHAnsi" w:cstheme="minorHAnsi"/>
+          <w:b/>
+          <w:bCs/>
+          <w:color w:val="000000"/>
+          <w:sz w:val="22"/>
+          <w:szCs w:val="22"/>
+          <w:shd w:val="clear" w:color="auto" w:fill="FFFFFF"/>
+          <w:lang w:eastAsia="es-MX"/>
+        </w:rPr>
+        <w:t>BBVA:</w:t>
+      </w:r>
+      <w:r>
+        <w:rPr>
+          <w:rFonts w:asciiTheme="minorHAnsi" w:eastAsia="Times New Roman" w:hAnsiTheme="minorHAnsi" w:cstheme="minorHAnsi"/>
+          <w:color w:val="000000"/>
+          <w:sz w:val="22"/>
+          <w:szCs w:val="22"/>
+          <w:shd w:val="clear" w:color="auto" w:fill="FFFFFF"/>
+          <w:lang w:eastAsia="es-MX"/>
+        </w:rPr>
+        <w:t xml:space="preserve"> </w:t>
+      </w:r>
+    </w:p>
+    <w:p>
+      <w:pPr>
+        <w:spacing w:after="0" w:line="240" w:lineRule="auto"/>
+        <w:rPr>
+          <w:rFonts w:asciiTheme="minorHAnsi" w:eastAsia="Times New Roman" w:hAnsiTheme="minorHAnsi" w:cstheme="minorHAnsi"/>
+          <w:color w:val="000000"/>
+          <w:sz w:val="22"/>
+          <w:szCs w:val="22"/>
+          <w:shd w:val="clear" w:color="auto" w:fill="FFFFFF"/>
+          <w:lang w:eastAsia="es-MX"/>
+        </w:rPr>
+      </w:pPr>
+      <w:r>
+        <w:rPr>
+          <w:rFonts w:asciiTheme="minorHAnsi" w:eastAsia="Times New Roman" w:hAnsiTheme="minorHAnsi" w:cstheme="minorHAnsi"/>
+          <w:color w:val="000000"/>
+          <w:sz w:val="22"/>
+          <w:szCs w:val="22"/>
+          <w:shd w:val="clear" w:color="auto" w:fill="FFFFFF"/>
+          <w:lang w:eastAsia="es-MX"/>
+        </w:rPr>
+        <w:t>Cta Corriente 0569026511</w:t>
       </w:r>
     </w:p>
     <w:p>
@@ -4219,17 +4367,15 @@
           <w:shd w:val="clear" w:color="auto" w:fill="FFFFFF"/>
         </w:rPr>
       </w:pPr>
-      <w:proofErr w:type="gramStart"/>
-      <w:r>
-        <w:rPr>
-          <w:rFonts w:asciiTheme="minorHAnsi" w:hAnsiTheme="minorHAnsi" w:cstheme="minorHAnsi"/>
-          <w:sz w:val="22"/>
-          <w:szCs w:val="22"/>
-          <w:shd w:val="clear" w:color="auto" w:fill="FFFFFF"/>
-        </w:rPr>
-        <w:t>Los tiquetes de los programas turísticos es punto a punto</w:t>
-      </w:r>
-      <w:proofErr w:type="gramEnd"/>
+      <w:r>
+        <w:rPr>
+          <w:rFonts w:asciiTheme="minorHAnsi" w:hAnsiTheme="minorHAnsi" w:cstheme="minorHAnsi"/>
+          <w:sz w:val="22"/>
+          <w:szCs w:val="22"/>
+          <w:shd w:val="clear" w:color="auto" w:fill="FFFFFF"/>
+        </w:rPr>
+        <w:t>Los tiquetes de los programas turísticos son punto a punto</w:t>
+      </w:r>
       <w:r>
         <w:rPr>
           <w:rFonts w:asciiTheme="minorHAnsi" w:hAnsiTheme="minorHAnsi" w:cstheme="minorHAnsi"/>
@@ -4257,7 +4403,18 @@
           <w:szCs w:val="22"/>
           <w:shd w:val="clear" w:color="auto" w:fill="FFFFFF"/>
         </w:rPr>
-        <w:t xml:space="preserve"> Si por cualquier motivo el pasajero se ve obligado a suspender el itinerario de los vuelos previstos (por voluntad propia, accidente, negligencia, urgencia de regreso, enfermedad, requerimiento legal o migratorio etc.), y no puede realizar los vuelos indicados en el itinerario en las fechas confirmadas; se perderá en su totalidad el tiquete aplicando la regla de la tarifa aérea promocional “no permite cambio de fecha ni ruta” por lo tanto no hay lugar a reembolso por dicho cambio. *No aplican certificados médicos.</w:t>
+        <w:t xml:space="preserve"> Si por cualquier motivo el pasajero se ve obligado a suspender el itinerario de los vuelos previstos (por voluntad propia, accidente, </w:t>
+      </w:r>
+      <w:r>
+        <w:rPr>
+          <w:rFonts w:asciiTheme="minorHAnsi" w:hAnsiTheme="minorHAnsi" w:cstheme="minorHAnsi"/>
+          <w:color w:val="000000"/>
+          <w:sz w:val="22"/>
+          <w:szCs w:val="22"/>
+          <w:shd w:val="clear" w:color="auto" w:fill="FFFFFF"/>
+        </w:rPr>
+        <w:lastRenderedPageBreak/>
+        <w:t>negligencia, urgencia de regreso, enfermedad, requerimiento legal o migratorio etc.), y no puede realizar los vuelos indicados en el itinerario en las fechas confirmadas; se perderá en su totalidad el tiquete aplicando la regla de la tarifa aérea promocional “no permite cambio de fecha ni ruta” por lo tanto no hay lugar a reembolso por dicho cambio. *No aplican certificados médicos.</w:t>
       </w:r>
     </w:p>
     <w:p>
@@ -4302,7 +4459,17 @@
           <w:szCs w:val="22"/>
           <w:shd w:val="clear" w:color="auto" w:fill="FFFFFF"/>
         </w:rPr>
-        <w:t xml:space="preserve"> in o en </w:t>
+        <w:t>-</w:t>
+      </w:r>
+      <w:r>
+        <w:rPr>
+          <w:rFonts w:asciiTheme="minorHAnsi" w:hAnsiTheme="minorHAnsi" w:cstheme="minorHAnsi"/>
+          <w:color w:val="000000"/>
+          <w:sz w:val="22"/>
+          <w:szCs w:val="22"/>
+          <w:shd w:val="clear" w:color="auto" w:fill="FFFFFF"/>
+        </w:rPr>
+        <w:t xml:space="preserve">in o en </w:t>
       </w:r>
       <w:proofErr w:type="spellStart"/>
       <w:r>
@@ -4736,20 +4903,29 @@
           <w:szCs w:val="22"/>
           <w:shd w:val="clear" w:color="auto" w:fill="FFFFFF"/>
         </w:rPr>
-        <w:t xml:space="preserve">Será responsabilidad del CLIENTE suministrar la información que LA EMPRESA le ha brindado a éste, a cada una de las personas relacionadas en la presente cláusula y que lo acompañarán al destino turístico elegido, así como la de entregar a todos y cada una de las personas que irán al destino turístico, los documentos suministrados por la empresa. Será responsabilidad absoluta del CLIENTE la de entregar a los beneficiarios los requisitos exigidos por los diferentes destinos turísticos, los </w:t>
-      </w:r>
-      <w:proofErr w:type="gramStart"/>
-      <w:r>
-        <w:rPr>
-          <w:rFonts w:asciiTheme="minorHAnsi" w:hAnsiTheme="minorHAnsi" w:cstheme="minorHAnsi"/>
-          <w:color w:val="000000"/>
-          <w:sz w:val="22"/>
-          <w:szCs w:val="22"/>
-          <w:shd w:val="clear" w:color="auto" w:fill="FFFFFF"/>
-        </w:rPr>
-        <w:t>cuales  ha</w:t>
-      </w:r>
-      <w:proofErr w:type="gramEnd"/>
+        <w:t xml:space="preserve">Será responsabilidad del CLIENTE suministrar la información que LA EMPRESA le ha brindado a éste, a cada una de las personas relacionadas en la presente cláusula y que lo acompañarán al destino turístico elegido, así como la de entregar a todos y cada una de las personas que irán al destino turístico, los documentos suministrados por la empresa. Será responsabilidad absoluta del CLIENTE la de entregar a los </w:t>
+      </w:r>
+      <w:r>
+        <w:rPr>
+          <w:rFonts w:asciiTheme="minorHAnsi" w:hAnsiTheme="minorHAnsi" w:cstheme="minorHAnsi"/>
+          <w:color w:val="000000"/>
+          <w:sz w:val="22"/>
+          <w:szCs w:val="22"/>
+          <w:shd w:val="clear" w:color="auto" w:fill="FFFFFF"/>
+        </w:rPr>
+        <w:lastRenderedPageBreak/>
+        <w:t xml:space="preserve">beneficiarios los requisitos exigidos por los diferentes destinos turísticos, los </w:t>
+      </w:r>
+      <w:r>
+        <w:rPr>
+          <w:rFonts w:asciiTheme="minorHAnsi" w:hAnsiTheme="minorHAnsi" w:cstheme="minorHAnsi"/>
+          <w:color w:val="000000"/>
+          <w:sz w:val="22"/>
+          <w:szCs w:val="22"/>
+          <w:shd w:val="clear" w:color="auto" w:fill="FFFFFF"/>
+        </w:rPr>
+        <w:t>cuales ha</w:t>
+      </w:r>
       <w:r>
         <w:rPr>
           <w:rFonts w:asciiTheme="minorHAnsi" w:hAnsiTheme="minorHAnsi" w:cstheme="minorHAnsi"/>

</xml_diff>